<commit_message>
Completar trazabilidad y evidencia con referencias internas
</commit_message>
<xml_diff>
--- a/docs/ERS/Apendice-A-Casos-de-Uso-v2.0.docx
+++ b/docs/ERS/Apendice-A-Casos-de-Uso-v2.0.docx
@@ -521,22 +521,16 @@
         <w:rPr/>
       </w:pPr>
       <w:r>
-        <w:rPr>
-          <w:rtl w:val="0"/>
-        </w:rPr>
-        <w:t xml:space="preserve">RF asociados: RF-06, RF-07, RF-08, RF-09, RF-10, RF-11.</w:t>
-      </w:r>
-    </w:p>
-    <w:p>
-      <w:pPr>
-        <w:spacing w:after="120" w:before="0" w:line="264" w:lineRule="auto"/>
-        <w:rPr/>
-      </w:pPr>
-      <w:r>
-        <w:rPr>
-          <w:rtl w:val="0"/>
-        </w:rPr>
-        <w:t xml:space="preserve">Implementación: UsuarioServicio. Datos: Usuarios, Roles. Pruebas: UsuariosValidacionPruebas.</w:t>
+        <w:t>RF asociados: RF-06, RF-07, RF-08, RF-09, RF-10, RF-11, RF-73.</w:t>
+      </w:r>
+    </w:p>
+    <w:p>
+      <w:pPr>
+        <w:spacing w:after="120" w:before="0" w:line="264" w:lineRule="auto"/>
+        <w:rPr/>
+      </w:pPr>
+      <w:r>
+        <w:t>Implementación: UsuarioServicio y AuditoriaAccesoServicio. Datos: Usuarios, Roles, ControlesAcceso y EventosAcceso. Pruebas: UsuariosValidacionPruebas.</w:t>
       </w:r>
     </w:p>
     <w:p>
@@ -752,10 +746,7 @@
         <w:rPr/>
       </w:pPr>
       <w:r>
-        <w:rPr>
-          <w:rtl w:val="0"/>
-        </w:rPr>
-        <w:t xml:space="preserve">Implementación: ClienteServicio, VehiculoServicio. Datos: Clientes, Vehiculos, Modelos, Marcas. Pruebas: MaestrosPruebas.</w:t>
+        <w:t>Implementación: ClienteServicio, VehiculoServicio y ConceptoServicio. Datos: Clientes, Vehiculos, Modelos, Marcas. Pruebas: MaestrosPruebas.</w:t>
       </w:r>
     </w:p>
     <w:p>

</xml_diff>

<commit_message>
Alinear documentos y diagramas con cinco migraciones y corregir escenario SQL
</commit_message>
<xml_diff>
--- a/docs/ERS/Apendice-A-Casos-de-Uso-v2.0.docx
+++ b/docs/ERS/Apendice-A-Casos-de-Uso-v2.0.docx
@@ -404,10 +404,7 @@
         <w:rPr/>
       </w:pPr>
       <w:r>
-        <w:rPr>
-          <w:rtl w:val="0"/>
-        </w:rPr>
-        <w:t xml:space="preserve">CU02.2 Registra o edita datos y un rol válido; puede generar contraseña aleatoria.</w:t>
+        <w:t>CU02.2 Registra o edita datos y un rol válido; puede generar contraseña aleatoria. La edición conserva la versión consultada; datos, credenciales y estado rechazan conflictos concurrentes.</w:t>
       </w:r>
     </w:p>
     <w:p>

</xml_diff>

<commit_message>
Sincronizar seis migraciones, documentos académicos y evidencia de la tercera revisión
</commit_message>
<xml_diff>
--- a/docs/ERS/Apendice-A-Casos-de-Uso-v2.0.docx
+++ b/docs/ERS/Apendice-A-Casos-de-Uso-v2.0.docx
@@ -1328,10 +1328,7 @@
         <w:rPr/>
       </w:pPr>
       <w:r>
-        <w:rPr>
-          <w:rtl w:val="0"/>
-        </w:rPr>
-        <w:t xml:space="preserve">CU06.4 Registra persona del cliente/representante, medio, observación y selección de ítems; autor interno sale de sesión.</w:t>
+        <w:t>CU06.4 Registra persona del cliente/representante, medio, observación y selección de ítems; autor interno sale de sesión. Persona y canal son obligatorios en aplicación y persistencia.</w:t>
       </w:r>
     </w:p>
     <w:p>
@@ -2300,10 +2297,7 @@
         <w:rPr/>
       </w:pPr>
       <w:r>
-        <w:rPr>
-          <w:rtl w:val="0"/>
-        </w:rPr>
-        <w:t xml:space="preserve">CU10.2 Para manual elige completa/diferencial, carpeta del servidor y réplica Azure opcional.</w:t>
+        <w:t>CU10.2 Para manual elige completa/diferencial, carpeta del servidor y réplica Azure opcional. La réplica distingue la verificación del archivo de negocio y del auxiliar de control.</w:t>
       </w:r>
     </w:p>
     <w:p>

</xml_diff>